<commit_message>
docs: bo sung chi tiet nguon du lieu cao va luong van hanh truc tiep vao de cuong
</commit_message>
<xml_diff>
--- a/docs/DeCuong_DeTai_HoanThien.docx
+++ b/docs/DeCuong_DeTai_HoanThien.docx
@@ -410,7 +410,7 @@
         <w:jc w:val="left"/>
       </w:pPr>
       <w:r>
-        <w:t>Trong những năm gần đây, không gian mạng chứng kiến sự gia tăng đột biến của các cuộc tấn công có chủ đích quy mô lớn (APT), các chiến dịch mã độc tống tiền (Ransomware) và khai thác lỗ hổng bảo mật nghiêm trọng. Hằng ngày, hàng nghìn báo cáo kỹ thuật và cảnh báo đe dọa được công bố từ các cơ quan an ninh chính phủ và các tổ chức bảo mật uy tín trên toàn thế giới. Trước tình hình đó, các Trung tâm Điều hành An ninh mạng (SOC) đối mặt với thách thức quá tải nghiêm trọng về dữ liệu tình báo mối đe dọa mạng (Cyber Threat Intelligence - CTI).</w:t>
+        <w:t>Trong những năm gần đây, không gian mạng chứng kiến sự gia tăng đột biến của các cuộc tấn công có chủ đích quy mô lớn (APT), các chiến dịch mã độc tống tiền (Ransomware) nguy hiểm và các vụ khai thác lỗ hổng bảo mật nghiêm trọng. Hằng ngày, hàng nghìn báo cáo kỹ thuật và cảnh báo đe dọa được công bố liên tục từ các cơ quan an ninh mạng chính phủ và các tổ chức nghiên cứu bảo mật uy tín trên toàn thế giới. Trước tình hình đó, các Trung tâm Điều hành An ninh mạng (SOC) đối mặt với thách thức quá tải nghiêm trọng về dữ liệu tình báo mối đe dọa mạng (Cyber Threat Intelligence - CTI).</w:t>
       </w:r>
     </w:p>
     <w:p>
@@ -428,16 +428,16 @@
         <w:jc w:val="left"/>
       </w:pPr>
       <w:r>
-        <w:t>Đề tài tập trung nghiên cứu cơ chế hoạt động của chu trình CTI, xây dựng hệ thống Tác tử Trí tuệ Nhân tạo đa công cụ (Single-Agent with Security Toolbox) nhằm tự động hóa hoàn toàn quy trình: từ thu thập dữ liệu nguồn mở (OSINT) chính thống TLP:CLEAR, trích xuất chuẩn hóa IOCs, thẩm định mức độ nguy hại, ánh xạ kỹ thuật tấn công theo ma trận MITRE ATT&amp;CK, cho đến việc tự động sinh các tập quy tắc phòng thủ thực chiến trong thời gian thực.</w:t>
-      </w:r>
-    </w:p>
-    <w:p>
-      <w:pPr>
-        <w:spacing w:line="360" w:lineRule="auto"/>
-        <w:jc w:val="left"/>
-      </w:pPr>
-      <w:r>
-        <w:t>Việc lựa chọn đề tài là hết sức cần thiết và mang tính thời sự cao vì giúp chuyển hóa tri thức tình báo thành hành động phòng thủ tức thì (Actionable Defense), giảm thiểu tối đa thời gian phản ứng sự cố cho các trung tâm điều hành an ninh mạng, đồng thời nâng cao năng lực nghiên cứu ứng dụng AI trong an toàn thông tin hiện đại.</w:t>
+        <w:t>Đề tài tập trung nghiên cứu cơ chế hoạt động của chu trình CTI, xây dựng hệ thống Tác tử Trí tuệ Nhân tạo đa công cụ (AI Agent with Security Toolbox) nhằm tự động hóa hoàn toàn quy trình: từ thu thập tự động dữ liệu nguồn mở (OSINT) chính thống chuẩn TLP:CLEAR từ các cơ quan an ninh chính phủ (CISA KEV, CISA Advisories) và báo chí bảo mật quốc tế uy tín (The Hacker News, BleepingComputer, NIST NVD), trích xuất chuẩn hóa IOCs, thẩm định mức độ nguy hại, ánh xạ kỹ thuật tấn công theo ma trận MITRE ATT&amp;CK, cho đến việc tự động sinh các tập quy tắc phòng thủ thực chiến trong thời gian thực.</w:t>
+      </w:r>
+    </w:p>
+    <w:p>
+      <w:pPr>
+        <w:spacing w:line="360" w:lineRule="auto"/>
+        <w:jc w:val="left"/>
+      </w:pPr>
+      <w:r>
+        <w:t>Đặc biệt, điểm then chốt mang tính thực tiễn cao của đề tài là: toàn bộ dữ liệu cào và thu thập về không phải chỉ để minh họa tĩnh một lần, mà chính là nguồn dữ liệu sống (Live Threat Data Ingestion) được tích hợp trực tiếp và vận hành liên tục xuyên suốt toàn bộ hệ thống sau này: từ lưu trữ bền vững làm cơ sở tri thức (Knowledge Base) trên SQLite, nuôi dưỡng bộ não AI Agent suy luận, thẩm định độc hại qua VirusTotal/AbuseIPDB, cho đến việc tự động chuyển hóa thành các bộ quy tắc phòng thủ (Sigma cho SIEM Wazuh/Splunk, YARA cho Endpoint, Blocklist cho Firewall) và đóng gói STIX 2.1 để ứng dụng thực tế lâu dài, bảo đảm 100% tính minh bạch và an toàn pháp lý theo Luật An toàn thông tin mạng.</w:t>
       </w:r>
     </w:p>
     <w:p>
@@ -534,8 +534,77 @@
         <w:spacing w:line="360" w:lineRule="auto"/>
         <w:jc w:val="left"/>
       </w:pPr>
-      <w:r>
-        <w:t>Đề tài hướng đến các mục tiêu chính sau:</w:t>
+      <w:proofErr w:type="spellStart"/>
+      <w:r>
+        <w:t>Đề</w:t>
+      </w:r>
+      <w:proofErr w:type="spellEnd"/>
+      <w:r>
+        <w:t xml:space="preserve"> </w:t>
+      </w:r>
+      <w:proofErr w:type="spellStart"/>
+      <w:r>
+        <w:t>tài</w:t>
+      </w:r>
+      <w:proofErr w:type="spellEnd"/>
+      <w:r>
+        <w:t xml:space="preserve"> </w:t>
+      </w:r>
+      <w:proofErr w:type="spellStart"/>
+      <w:r>
+        <w:t>hướng</w:t>
+      </w:r>
+      <w:proofErr w:type="spellEnd"/>
+      <w:r>
+        <w:t xml:space="preserve"> </w:t>
+      </w:r>
+      <w:proofErr w:type="spellStart"/>
+      <w:r>
+        <w:t>đến</w:t>
+      </w:r>
+      <w:proofErr w:type="spellEnd"/>
+      <w:r>
+        <w:t xml:space="preserve"> </w:t>
+      </w:r>
+      <w:proofErr w:type="spellStart"/>
+      <w:r>
+        <w:t>các</w:t>
+      </w:r>
+      <w:proofErr w:type="spellEnd"/>
+      <w:r>
+        <w:t xml:space="preserve"> </w:t>
+      </w:r>
+      <w:proofErr w:type="spellStart"/>
+      <w:r>
+        <w:t>mục</w:t>
+      </w:r>
+      <w:proofErr w:type="spellEnd"/>
+      <w:r>
+        <w:t xml:space="preserve"> </w:t>
+      </w:r>
+      <w:proofErr w:type="spellStart"/>
+      <w:r>
+        <w:t>tiêu</w:t>
+      </w:r>
+      <w:proofErr w:type="spellEnd"/>
+      <w:r>
+        <w:t xml:space="preserve"> </w:t>
+      </w:r>
+      <w:proofErr w:type="spellStart"/>
+      <w:r>
+        <w:t>chính</w:t>
+      </w:r>
+      <w:proofErr w:type="spellEnd"/>
+      <w:r>
+        <w:t xml:space="preserve"> </w:t>
+      </w:r>
+      <w:proofErr w:type="spellStart"/>
+      <w:r>
+        <w:t>sau</w:t>
+      </w:r>
+      <w:proofErr w:type="spellEnd"/>
+      <w:r>
+        <w:t>:</w:t>
       </w:r>
     </w:p>
     <w:p>
@@ -548,7 +617,7 @@
         <w:jc w:val="left"/>
       </w:pPr>
       <w:r>
-        <w:t>Nghiên cứu cơ sở lý thuyết về Tình báo Mối đe dọa An ninh mạng (CTI), chuẩn dữ liệu STIX 2.1, ma trận MITRE ATT&amp;CK Enterprise và kiến trúc tác tử suy luận AI (ReAct / Tool-Calling Agent).</w:t>
+        <w:t>Nghiên cứu cơ sở lý thuyết về Tình báo Mối đe dọa An ninh mạng (CTI), chuẩn dữ liệu OASIS STIX 2.1, ma trận MITRE ATT&amp;CK Enterprise và kiến trúc tác tử AI tự chủ (ReAct / Tool-Calling Agent).</w:t>
       </w:r>
     </w:p>
     <w:p>
@@ -561,7 +630,7 @@
         <w:jc w:val="left"/>
       </w:pPr>
       <w:r>
-        <w:t>Thu thập và chuẩn hóa dữ liệu tình báo nguồn mở (OSINT) từ các nguồn chính thống TLP:CLEAR (CISA KEV, CISA Advisories, TheHackerNews, BleepingComputer).</w:t>
+        <w:t>Thu thập dữ liệu nguồn mở (OSINT) chuẩn TLP:CLEAR từ các nguồn chính thống và chuyên ngành uy tín: CISA KEV Catalog (JSON API), CISA Advisories &amp; Alerts, The Hacker News, BleepingComputer và NIST NVD.</w:t>
       </w:r>
     </w:p>
     <w:p>
@@ -574,7 +643,7 @@
         <w:jc w:val="left"/>
       </w:pPr>
       <w:r>
-        <w:t>Trích xuất chuẩn hóa các chỉ số xâm nhập (IOCs: IP, Domain, URL, MD5, SHA256, CVE) kết hợp giữa biểu thức chính quy (Regex) và mô hình ngôn ngữ lớn (LLM).</w:t>
+        <w:t>Thiết lập đường ống nạp dữ liệu trực tiếp và bền vững (Live Ingestion &amp; Persistent Pipeline): dữ liệu cào về được băm MD5 khử trùng lặp và lưu trữ vĩnh viễn vào CSDL SQLite của hệ thống, tạo kho tri thức thường trực phục vụ toàn bộ chu trình xử lý sau này.</w:t>
       </w:r>
     </w:p>
     <w:p>
@@ -587,7 +656,7 @@
         <w:jc w:val="left"/>
       </w:pPr>
       <w:r>
-        <w:t>Tự động hóa quy trình thẩm định danh tiếng mối đe dọa qua các dịch vụ API uy tín (VirusTotal API v3, AbuseIPDB API) kèm cơ chế lưu đệm SQLite Caching chống cạn hạn mức.</w:t>
+        <w:t>Trích xuất chuẩn hóa các chỉ số xâm nhập (IOCs: IPv4/IPv6, Domain, URL, MD5, SHA256, CVE) kết hợp giữa bộ lọc Regex chuyên dụng và mô hình ngôn ngữ lớn (LLM) khử nhiễu ngữ cảnh.</w:t>
       </w:r>
     </w:p>
     <w:p>
@@ -600,7 +669,7 @@
         <w:jc w:val="left"/>
       </w:pPr>
       <w:r>
-        <w:t>Xây dựng tác tử AI có khả năng tự chủ suy luận và sinh quy tắc phòng thủ:</w:t>
+        <w:t>Tự động hóa quy trình thẩm định danh tiếng độc hại của các IOC thu thập được qua các dịch vụ API uy tín (VirusTotal API v3, AbuseIPDB API) kèm cơ chế bộ đệm Caching chống cạn hạn mức.</w:t>
       </w:r>
     </w:p>
     <w:p>
@@ -613,7 +682,7 @@
         <w:jc w:val="left"/>
       </w:pPr>
       <w:r>
-        <w:t>Phân tích ngữ cảnh và tự động ánh xạ kỹ thuật tấn công sang ma trận MITRE ATT&amp;CK.</w:t>
+        <w:t>Xây dựng tác tử AI có khả năng tự chủ suy luận và sinh quy tắc phòng thủ:</w:t>
       </w:r>
     </w:p>
     <w:p>
@@ -626,7 +695,7 @@
         <w:jc w:val="left"/>
       </w:pPr>
       <w:r>
-        <w:t>Tự động sinh quy tắc Sigma (.yml) phát hiện hành vi tấn công trên hệ thống SIEM/EDR (Wazuh, Splunk).</w:t>
+        <w:t>Phân tích ngữ cảnh kỹ thuật và tự động ánh xạ hành vi tấn công sang ma trận kỹ thuật MITRE ATT&amp;CK Enterprise (ví dụ: T1059, T1105, T1566).</w:t>
       </w:r>
     </w:p>
     <w:p>
@@ -639,7 +708,7 @@
         <w:jc w:val="left"/>
       </w:pPr>
       <w:r>
-        <w:t>Tự động sinh quy tắc YARA (.yar) quét nhận diện mẫu mã độc trên máy trạm (Endpoint).</w:t>
+        <w:t>Tự động sinh quy tắc Sigma (.yml) phát hiện hành vi tấn công trên hệ thống SIEM/EDR (Wazuh, Splunk).</w:t>
       </w:r>
     </w:p>
     <w:p>
@@ -652,7 +721,7 @@
         <w:jc w:val="left"/>
       </w:pPr>
       <w:r>
-        <w:t>Xuất danh sách Firewall Blocklist (.txt) nạp vào tường lửa để ngăn chặn kết nối C2 khẩn cấp.</w:t>
+        <w:t>Tự động sinh quy tắc YARA (.yar) quét nhận diện mẫu mã độc trên máy trạm (Endpoint).</w:t>
       </w:r>
     </w:p>
     <w:p>
@@ -665,7 +734,7 @@
         <w:jc w:val="left"/>
       </w:pPr>
       <w:r>
-        <w:t>Đóng gói dữ liệu đầu ra theo chuẩn quốc tế OASIS STIX 2.1 JSON phục vụ tích hợp và chia sẻ tình báo.</w:t>
+        <w:t>Xuất danh sách Firewall Blocklist (.txt) nạp vào tường lửa để ngăn chặn kết nối C2 khẩn cấp.</w:t>
       </w:r>
     </w:p>
     <w:p>
@@ -678,7 +747,7 @@
         <w:jc w:val="left"/>
       </w:pPr>
       <w:r>
-        <w:t>Xây dựng ứng dụng Web Dashboard trực quan và giao diện RESTful API (FastAPI) phục vụ chuyên viên giám sát.</w:t>
+        <w:t>Đóng gói dữ liệu đầu ra theo chuẩn quốc tế OASIS STIX 2.1 JSON phục vụ tích hợp và chia sẻ tình báo với các nền tảng SOC/TIP (MISP, OpenCTI).</w:t>
       </w:r>
     </w:p>
     <w:p>
@@ -691,7 +760,7 @@
         <w:jc w:val="left"/>
       </w:pPr>
       <w:r>
-        <w:t>Đánh giá hiệu năng và tính ổn định của hệ thống thông qua kiểm thử trên tập dữ liệu báo cáo APT thực tế.</w:t>
+        <w:t>Xây dựng ứng dụng Web Dashboard trực quan và giao diện RESTful API (FastAPI) phục vụ chuyên viên giám sát và điều hành luồng phân tích.</w:t>
       </w:r>
     </w:p>
     <w:p>
@@ -730,7 +799,7 @@
         <w:jc w:val="left"/>
       </w:pPr>
       <w:r>
-        <w:t>Đo lường thời gian xử lý toàn trình và so sánh với quy trình phân tích thủ công.</w:t>
+        <w:t>Đo lường thời gian xử lý toàn trình và so sánh hiệu quả với quy trình phân tích thủ công.</w:t>
       </w:r>
     </w:p>
     <w:p>
@@ -888,7 +957,7 @@
         <w:jc w:val="left"/>
       </w:pPr>
       <w:r>
-        <w:t>Tổng quan về Cyber Threat Intelligence (CTI) và vòng đời tình báo.</w:t>
+        <w:t>Tổng quan về Cyber Threat Intelligence (CTI) và vòng đời tình báo an ninh mạng.</w:t>
       </w:r>
     </w:p>
     <w:p>
@@ -901,7 +970,7 @@
         <w:jc w:val="left"/>
       </w:pPr>
       <w:r>
-        <w:t>Nghiên cứu chuẩn biểu diễn dữ liệu STIX 2.1 và giao thức TAXII.</w:t>
+        <w:t>Nghiên cứu chuẩn biểu diễn dữ liệu OASIS STIX 2.1 và giao thức chia sẻ TAXII.</w:t>
       </w:r>
     </w:p>
     <w:p>
@@ -998,7 +1067,7 @@
         <w:jc w:val="left"/>
       </w:pPr>
       <w:r>
-        <w:t>Thiết kế giao ước dữ liệu chung (Shared Schemas bằng Pydantic): RawThreatData, ExtractedIOC, EnrichedIOC, MitreTechnique, DefensiveRules.</w:t>
+        <w:t>Thiết kế giao ước dữ liệu chung (Shared Schemas bằng Pydantic): RawThreatData, ExtractedIOC, EnrichedIOC, MitreTechnique, DefensiveRules, STIXPackage.</w:t>
       </w:r>
     </w:p>
     <w:p>
@@ -1024,7 +1093,7 @@
         <w:jc w:val="left"/>
       </w:pPr>
       <w:r>
-        <w:t>Thiết kế kiến trúc Backend RESTful API (FastAPI) và giao diện Web Dashboard.</w:t>
+        <w:t>Thiết kế kiến trúc Backend RESTful API (FastAPI) và giao diện Web Dashboard trực quan hóa luồng suy luận.</w:t>
       </w:r>
     </w:p>
     <w:p>
@@ -1056,7 +1125,7 @@
         </w:rPr>
       </w:pPr>
       <w:r>
-        <w:t>3. Xây dựng bộ công cụ thu thập và làm giàu dữ liệu</w:t>
+        <w:t>3. Xây dựng bộ công cụ thu thập dữ liệu nguồn mở và luồng sử dụng trực tiếp trong hệ thống</w:t>
       </w:r>
     </w:p>
     <w:p>
@@ -1069,7 +1138,7 @@
         <w:jc w:val="left"/>
       </w:pPr>
       <w:r>
-        <w:t>Xây dựng Tool 1 (fetch_rss_feeds): Thu thập tự động bài viết phân tích mã độc từ TheHackerNews và BleepingComputer qua RSS/XML.</w:t>
+        <w:t>Các nguồn dữ liệu thu thập (Nguồn cào): Hệ thống tự động thu thập từ các nguồn OSINT chính thống TLP:CLEAR gồm: (1) CISA KEV Catalog JSON (danh mục lỗ hổng bị khai thác thực tế của chính phủ Mỹ); (2) CISA Security Advisories &amp; Alerts (báo cáo cảnh báo chiến dịch APT khẩn cấp); (3) The Hacker News (RSS Feed và bài phân tích chuyên sâu về mã độc/zero-day); (4) BleepingComputer (RSS Feed phân tích Ransomware và IoC mới); (5) NIST NVD / MITRE CVE (dữ liệu đặc tả lỗ hổng và điểm CVSS v3).</w:t>
       </w:r>
     </w:p>
     <w:p>
@@ -1082,7 +1151,7 @@
         <w:jc w:val="left"/>
       </w:pPr>
       <w:r>
-        <w:t>Xây dựng Tool 2 (fetch_cisa_kev): Truy vấn danh mục lỗ hổng bị khai thác thực tế CISA KEV JSON của chính phủ Mỹ.</w:t>
+        <w:t>Tính chất trực tiếp và lâu dài của nguồn dữ liệu: Toàn bộ dữ liệu cào về là dòng dữ liệu sống (Live Threat Data Ingestion), được sử dụng trực tiếp và duy nhất để vận hành toàn bộ hệ thống sau này (không dùng dữ liệu mô phỏng tĩnh). Dữ liệu được lưu trữ vĩnh viễn vào SQLite Caching Database (khử trùng lặp qua băm MD5 URL) làm kho tri thức tình báo tích lũy liên tục.</w:t>
       </w:r>
     </w:p>
     <w:p>
@@ -1095,7 +1164,7 @@
         <w:jc w:val="left"/>
       </w:pPr>
       <w:r>
-        <w:t>Xây dựng Tool 3 (check_virustotal): Kiểm tra tỷ lệ độc hại (Malicious Detection Ratio) của Hash, IP, Domain qua VirusTotal API v3.</w:t>
+        <w:t>Nuôi dưỡng bộ não AI Agent bằng dữ liệu cào (Context Feeding): Nội dung bài viết, phân tích kỹ thuật cào về được nạp thẳng làm dữ liệu đầu vào cho Tác tử AI Agent để bóc tách tự động các chỉ số xâm nhập (IoC: IP, Domain, Hash, CVE) và suy luận ánh xạ ma trận kỹ thuật tấn công MITRE ATT&amp;CK Enterprise.</w:t>
       </w:r>
     </w:p>
     <w:p>
@@ -1108,7 +1177,7 @@
         <w:jc w:val="left"/>
       </w:pPr>
       <w:r>
-        <w:t>Xây dựng Tool 4 (check_abuseipdb): Kiểm tra điểm tin cậy lạm dụng (Abuse Confidence Score) của các địa chỉ IP qua AbuseIPDB API.</w:t>
+        <w:t>Xây dựng Tool 1 (fetch_rss_feeds): Thu thập tự động bài viết phân tích mã độc từ TheHackerNews và BleepingComputer qua giao thức RSS/XML kèm crawler trích xuất nội dung bài viết.</w:t>
       </w:r>
     </w:p>
     <w:p>
@@ -1121,7 +1190,7 @@
         <w:jc w:val="left"/>
       </w:pPr>
       <w:r>
-        <w:t>Xây dựng Tool 5 (export_stix_package): Đóng gói toàn bộ chiến dịch thành tệp JSON chuẩn OASIS STIX 2.1.</w:t>
+        <w:t>Xây dựng Tool 2 (fetch_cisa_kev): Truy vấn định kỳ và cập nhật danh mục lỗ hổng bị khai thác thực tế CISA KEV JSON của chính phủ Mỹ.</w:t>
       </w:r>
     </w:p>
     <w:p>
@@ -1134,7 +1203,7 @@
         <w:jc w:val="left"/>
       </w:pPr>
       <w:r>
-        <w:t>Tối ưu hóa cơ chế truy vấn API và xử lý ngoại lệ khi mất kết nối mạng.</w:t>
+        <w:t>Xây dựng Tool 3 (check_virustotal): Kiểm tra tỷ lệ độc hại (Malicious Detection Ratio) của Hash, IP, Domain bóc tách được qua VirusTotal API v3.</w:t>
       </w:r>
     </w:p>
     <w:p>
@@ -1147,7 +1216,7 @@
         <w:jc w:val="left"/>
       </w:pPr>
       <w:r>
-        <w:t>Kiểm thử đơn vị (Unit Test) cho từng công cụ thu thập và làm giàu dữ liệu.</w:t>
+        <w:t>Xây dựng Tool 4 (check_abuseipdb): Kiểm tra điểm tin cậy lạm dụng (Abuse Confidence Score) của các địa chỉ IP qua AbuseIPDB API.</w:t>
       </w:r>
     </w:p>
     <w:p>
@@ -1160,7 +1229,7 @@
         <w:jc w:val="left"/>
       </w:pPr>
       <w:r>
-        <w:t>Xây dựng bộ lọc loại bỏ các bài viết trùng lặp dựa trên băm MD5 của URL.</w:t>
+        <w:t>Xây dựng Tool 5 (export_stix_package): Đóng gói toàn bộ chiến dịch tình báo từ dữ liệu cào thành tệp JSON chuẩn quốc tế OASIS STIX 2.1 phục vụ tích hợp chia sẻ cho MISP/OpenCTI.</w:t>
       </w:r>
     </w:p>
     <w:p>
@@ -1173,7 +1242,7 @@
         <w:jc w:val="left"/>
       </w:pPr>
       <w:r>
-        <w:t>Đảm bảo tuân thủ nghiêm ngặt nguyên tắc nguồn mở TLP:CLEAR, không thu thập dữ liệu nhạy cảm cá nhân (Zero PII).</w:t>
+        <w:t>Đảm bảo an toàn pháp lý và tối ưu hóa hệ thống: Cơ chế truy vấn API tự động xử lý ngoại lệ mất kết nối, tuân thủ nghiêm ngặt nguyên tắc nguồn mở TLP:CLEAR, không thu thập dữ liệu cá nhân nhạy cảm (Zero PII).</w:t>
       </w:r>
     </w:p>
     <w:p>
@@ -1215,7 +1284,7 @@
         <w:jc w:val="left"/>
       </w:pPr>
       <w:r>
-        <w:t>Xây dựng Tool 6 (extract_iocs): Bóc tách IP, Domain, Hash, CVE từ văn bản bằng bộ Regex chuyên dụng kết hợp LLM lọc nhiễu.</w:t>
+        <w:t>Xây dựng Tool 6 (extract_iocs): Bóc tách IP, Domain, Hash, CVE từ văn bản cào về bằng bộ Regex chuyên dụng kết hợp LLM lọc nhiễu ngữ cảnh.</w:t>
       </w:r>
     </w:p>
     <w:p>
@@ -1228,7 +1297,7 @@
         <w:jc w:val="left"/>
       </w:pPr>
       <w:r>
-        <w:t>Xây dựng Tool 7 (map_mitre_attack): Ánh xạ hành vi mô tả trong bài viết sang mã kỹ thuật MITRE ATT&amp;CK (ví dụ: T1059.001, T1105).</w:t>
+        <w:t>Xây dựng Tool 7 (map_mitre_attack): Ánh xạ hành vi mô tả trong bài viết sang mã kỹ thuật MITRE ATT&amp;CK (ví dụ: T1059.001, T1105, T1566).</w:t>
       </w:r>
     </w:p>
     <w:p>
@@ -1241,7 +1310,7 @@
         <w:jc w:val="left"/>
       </w:pPr>
       <w:r>
-        <w:t>Xây dựng Tool 8 (generate_defensive_rules): Tự động sinh tập luật phòng thủ 3 lớp: Sigma Rule (.yml), YARA Rule (.yar) và Firewall Blocklist (.txt).</w:t>
+        <w:t>Xây dựng Tool 8 (generate_defensive_rules): Tự động sinh tập luật phòng thủ 3 lớp: Sigma Rule (.yml) nạp vào SIEM/Wazuh, YARA Rule (.yar) nạp vào Endpoint và Firewall Blocklist (.txt) nạp vào tường lửa để ngăn chặn nguy cơ tức thì.</w:t>
       </w:r>
     </w:p>
     <w:p>
@@ -1254,7 +1323,7 @@
         <w:jc w:val="left"/>
       </w:pPr>
       <w:r>
-        <w:t>Áp dụng kỹ thuật Prompt Engineering nâng cao giúp AI sinh quy tắc đúng chuẩn cú pháp kỹ thuật.</w:t>
+        <w:t>Áp dụng kỹ thuật Prompt Engineering nâng cao giúp AI sinh quy tắc đúng chuẩn cú pháp kỹ thuật, tích hợp bộ kiểm tra cú pháp tự động (syntax validator).</w:t>
       </w:r>
     </w:p>
     <w:p>
@@ -1267,7 +1336,7 @@
         <w:jc w:val="left"/>
       </w:pPr>
       <w:r>
-        <w:t>Tích hợp giao diện Web Dashboard hiển thị luồng suy luận thời gian thực và cho phép tải gói luật phòng thủ.</w:t>
+        <w:t>Tích hợp giao diện Web Dashboard hiển thị luồng suy luận thời gian thực và cho phép chuyên viên phê duyệt tải gói luật phòng thủ.</w:t>
       </w:r>
     </w:p>
     <w:p>
@@ -1299,7 +1368,7 @@
         <w:jc w:val="left"/>
       </w:pPr>
       <w:r>
-        <w:t>Thu thập tập dữ liệu kiểm thử gồm các báo cáo chiến dịch tấn công APT thực tế được công bố công khai.</w:t>
+        <w:t>Thu thập tập dữ liệu kiểm thử gồm các báo cáo chiến dịch tấn công APT thực tế được công bố công khai từ các nguồn CTI chính thống.</w:t>
       </w:r>
     </w:p>
     <w:p>
@@ -1312,7 +1381,7 @@
         <w:jc w:val="left"/>
       </w:pPr>
       <w:r>
-        <w:t>Đánh giá chất lượng trích xuất IOC và độ chính xác của việc ánh xạ ma trận MITRE ATT&amp;CK.</w:t>
+        <w:t>Đánh giá chất lượng trích xuất IOC và độ chính xác của việc ánh xạ ma trận MITRE ATT&amp;CK trên dữ liệu thực tế.</w:t>
       </w:r>
     </w:p>
     <w:p>
@@ -1325,7 +1394,7 @@
         <w:jc w:val="left"/>
       </w:pPr>
       <w:r>
-        <w:t>Kiểm định tính hợp lệ cú pháp của các luật Sigma tự sinh bằng công cụ tiêu chuẩn sigma-cli và kiểm thử quét YARA.</w:t>
+        <w:t>Kiểm định tính hợp lệ cú pháp của các luật Sigma tự sinh bằng công cụ tiêu chuẩn sigma-cli và kiểm thử quét nhận diện mẫu mã độc bằng YARA.</w:t>
       </w:r>
     </w:p>
     <w:p>
@@ -1405,7 +1474,7 @@
         <w:jc w:val="left"/>
       </w:pPr>
       <w:r>
-        <w:t>Tài liệu kỹ thuật chính thức từ CISA, NIST NVD và các khuyến nghị an ninh mạng.</w:t>
+        <w:t>Tài liệu kỹ thuật chính thức từ CISA, NIST NVD và các khuyến nghị an ninh mạng quốc tế.</w:t>
       </w:r>
     </w:p>
     <w:p>
@@ -1483,7 +1552,7 @@
         <w:jc w:val="left"/>
       </w:pPr>
       <w:r>
-        <w:t>Thu thập dữ liệu nguồn mở OSINT chuẩn TLP:CLEAR từ các cổng công khai của CISA và báo chí bảo mật quốc tế.</w:t>
+        <w:t>Thu thập dữ liệu tự động, liên tục từ các nguồn OSINT thực chiến: CISA KEV JSON, CISA Advisories, The Hacker News RSS, BleepingComputer RSS và NIST NVD chuẩn TLP:CLEAR.</w:t>
       </w:r>
     </w:p>
     <w:p>
@@ -1496,7 +1565,7 @@
         <w:jc w:val="left"/>
       </w:pPr>
       <w:r>
-        <w:t>Ghi nhận nhật ký suy luận của tác tử (Reasoning Trace), log gọi Tool và kết quả thẩm định API.</w:t>
+        <w:t>Xây dựng đường ống dữ liệu trực tiếp (Live Ingestion Pipeline): dữ liệu cào về được băm MD5 khử trùng lặp, lưu vĩnh viễn vào SQLite Caching Database, sau đó nạp trực tiếp vào AI Agent để nuôi dưỡng suy luận và vận hành hệ thống thực tế.</w:t>
       </w:r>
     </w:p>
     <w:p>
@@ -1509,7 +1578,7 @@
         <w:jc w:val="left"/>
       </w:pPr>
       <w:r>
-        <w:t>Lưu trữ dữ liệu vào SQLite có đánh chỉ mục và mã băm MD5 để loại bỏ trùng lặp.</w:t>
+        <w:t>Ghi nhận nhật ký suy luận của tác tử (Reasoning Trace), log gọi Tool, kết quả thẩm định VirusTotal/AbuseIPDB và tập quy tắc phòng thủ tự sinh.</w:t>
       </w:r>
     </w:p>
     <w:p>
@@ -1535,7 +1604,7 @@
         <w:jc w:val="left"/>
       </w:pPr>
       <w:r>
-        <w:t>Đánh giá định lượng khả năng trích xuất IOC và độ chính xác ánh xạ MITRE ATT&amp;CK.</w:t>
+        <w:t>Đánh giá định lượng khả năng trích xuất IOC và độ chính xác ánh xạ MITRE ATT&amp;CK trên tập bài báo cào về.</w:t>
       </w:r>
     </w:p>
     <w:p>
@@ -1548,7 +1617,7 @@
         <w:jc w:val="left"/>
       </w:pPr>
       <w:r>
-        <w:t>Kiểm định cú pháp và tính khả thi của các quy tắc phòng thủ sinh tự động trên các công cụ kiểm tra tiêu chuẩn.</w:t>
+        <w:t>Kiểm định cú pháp và tính khả thi của các quy tắc phòng thủ sinh tự động trên các công cụ kiểm tra tiêu chuẩn (sigma-cli, yara-python).</w:t>
       </w:r>
     </w:p>
     <w:p>
@@ -1580,7 +1649,7 @@
         <w:jc w:val="left"/>
       </w:pPr>
       <w:r>
-        <w:t>Xây dựng thành công hệ thống phần mềm hoàn chỉnh gồm Bộ não AI Agent điều phối 8 công cụ bảo mật chuyên dụng.</w:t>
+        <w:t>Xây dựng thành công hệ thống phần mềm hoàn chỉnh gồm Bộ não AI Agent điều phối 8 công cụ bảo mật chuyên dụng và đường ống dữ liệu trực tiếp (Live Ingestion Pipeline).</w:t>
       </w:r>
     </w:p>
     <w:p>
@@ -1593,7 +1662,7 @@
         <w:jc w:val="left"/>
       </w:pPr>
       <w:r>
-        <w:t>Tự động trích xuất chuẩn hóa IOCs, thẩm định mức độ nguy hại và ánh xạ chính xác ma trận MITRE ATT&amp;CK từ bài báo cáo.</w:t>
+        <w:t>Hình thành kho cơ sở dữ liệu tình báo CTI hoạt động thực tế (Real-time CTI Database) thu thập liên tục từ CISA KEV, The Hacker News, BleepingComputer và NIST NVD.</w:t>
       </w:r>
     </w:p>
     <w:p>
@@ -1606,7 +1675,7 @@
         <w:jc w:val="left"/>
       </w:pPr>
       <w:r>
-        <w:t>Tự động sinh các tập luật phòng thủ thực chiến (Sigma Rules .yml, YARA Rules .yar, Firewall Blocklist .txt) và xuất gói dữ liệu STIX 2.1 JSON đạt chuẩn cú pháp.</w:t>
+        <w:t>Tự động trích xuất chuẩn hóa IOCs, thẩm định mức độ nguy hại qua VirusTotal/AbuseIPDB và ánh xạ chính xác ma trận MITRE ATT&amp;CK từ các bài báo cào được.</w:t>
       </w:r>
     </w:p>
     <w:p>
@@ -1619,7 +1688,7 @@
         <w:jc w:val="left"/>
       </w:pPr>
       <w:r>
-        <w:t>Xây dựng giao diện Web Dashboard trực quan và RESTful API hỗ trợ chuyên viên giám sát và tải gói phòng thủ.</w:t>
+        <w:t>Tự động sinh các tập luật phòng thủ thực chiến (Sigma Rules .yml nạp SIEM Wazuh/Splunk, YARA Rules .yar nạp Endpoint, Firewall Blocklist .txt nạp Firewall) và xuất gói dữ liệu STIX 2.1 JSON đạt chuẩn cú pháp.</w:t>
       </w:r>
     </w:p>
     <w:p>
@@ -1632,7 +1701,7 @@
         <w:jc w:val="left"/>
       </w:pPr>
       <w:r>
-        <w:t>Hoàn thành báo cáo chi tiết đề tài và kịch bản demo kiểm thử hệ thống.</w:t>
+        <w:t>Xây dựng giao diện Web Dashboard trực quan và RESTful API hỗ trợ chuyên viên giám sát và tải gói phòng thủ; hoàn thành báo cáo chi tiết đề tài và kịch bản demo nghiệm thu.</w:t>
       </w:r>
     </w:p>
     <w:p>
@@ -1746,34 +1815,58 @@
               <w:spacing w:line="360" w:lineRule="auto"/>
             </w:pPr>
             <w:r>
+              <w:rPr>
+                <w:rFonts w:ascii="Times New Roman" w:hAnsi="Times New Roman"/>
+              </w:rPr>
               <w:t xml:space="preserve">Giai </w:t>
             </w:r>
             <w:proofErr w:type="spellStart"/>
             <w:r>
+              <w:rPr>
+                <w:rFonts w:ascii="Times New Roman" w:hAnsi="Times New Roman"/>
+              </w:rPr>
               <w:t>đoạn</w:t>
             </w:r>
             <w:proofErr w:type="spellEnd"/>
             <w:r>
+              <w:rPr>
+                <w:rFonts w:ascii="Times New Roman" w:hAnsi="Times New Roman"/>
+              </w:rPr>
               <w:t xml:space="preserve"> / </w:t>
             </w:r>
             <w:proofErr w:type="spellStart"/>
             <w:r>
+              <w:rPr>
+                <w:rFonts w:ascii="Times New Roman" w:hAnsi="Times New Roman"/>
+              </w:rPr>
               <w:t>Nội</w:t>
             </w:r>
             <w:proofErr w:type="spellEnd"/>
             <w:r>
+              <w:rPr>
+                <w:rFonts w:ascii="Times New Roman" w:hAnsi="Times New Roman"/>
+              </w:rPr>
               <w:t xml:space="preserve"> dung </w:t>
             </w:r>
             <w:proofErr w:type="spellStart"/>
             <w:r>
+              <w:rPr>
+                <w:rFonts w:ascii="Times New Roman" w:hAnsi="Times New Roman"/>
+              </w:rPr>
               <w:t>công</w:t>
             </w:r>
             <w:proofErr w:type="spellEnd"/>
             <w:r>
+              <w:rPr>
+                <w:rFonts w:ascii="Times New Roman" w:hAnsi="Times New Roman"/>
+              </w:rPr>
               <w:t xml:space="preserve"> </w:t>
             </w:r>
             <w:proofErr w:type="spellStart"/>
             <w:r>
+              <w:rPr>
+                <w:rFonts w:ascii="Times New Roman" w:hAnsi="Times New Roman"/>
+              </w:rPr>
               <w:t>việc</w:t>
             </w:r>
             <w:proofErr w:type="spellEnd"/>
@@ -1792,17 +1885,29 @@
             </w:pPr>
             <w:proofErr w:type="spellStart"/>
             <w:r>
+              <w:rPr>
+                <w:rFonts w:ascii="Times New Roman" w:hAnsi="Times New Roman"/>
+              </w:rPr>
               <w:t>T</w:t>
             </w:r>
             <w:r>
+              <w:rPr>
+                <w:rFonts w:ascii="Times New Roman" w:hAnsi="Times New Roman"/>
+              </w:rPr>
               <w:t>uần</w:t>
             </w:r>
             <w:proofErr w:type="spellEnd"/>
             <w:r>
+              <w:rPr>
+                <w:rFonts w:ascii="Times New Roman" w:hAnsi="Times New Roman"/>
+              </w:rPr>
               <w:t xml:space="preserve"> </w:t>
             </w:r>
             <w:proofErr w:type="spellStart"/>
             <w:r>
+              <w:rPr>
+                <w:rFonts w:ascii="Times New Roman" w:hAnsi="Times New Roman"/>
+              </w:rPr>
               <w:t>thứ</w:t>
             </w:r>
             <w:proofErr w:type="spellEnd"/>
@@ -1835,6 +1940,9 @@
               <w:jc w:val="center"/>
             </w:pPr>
             <w:r>
+              <w:rPr>
+                <w:rFonts w:ascii="Times New Roman" w:hAnsi="Times New Roman"/>
+              </w:rPr>
               <w:t>1</w:t>
             </w:r>
           </w:p>
@@ -1853,6 +1961,9 @@
               <w:jc w:val="center"/>
             </w:pPr>
             <w:r>
+              <w:rPr>
+                <w:rFonts w:ascii="Times New Roman" w:hAnsi="Times New Roman"/>
+              </w:rPr>
               <w:t>2</w:t>
             </w:r>
           </w:p>
@@ -1871,6 +1982,9 @@
               <w:jc w:val="center"/>
             </w:pPr>
             <w:r>
+              <w:rPr>
+                <w:rFonts w:ascii="Times New Roman" w:hAnsi="Times New Roman"/>
+              </w:rPr>
               <w:t>3</w:t>
             </w:r>
           </w:p>
@@ -1889,6 +2003,9 @@
               <w:jc w:val="center"/>
             </w:pPr>
             <w:r>
+              <w:rPr>
+                <w:rFonts w:ascii="Times New Roman" w:hAnsi="Times New Roman"/>
+              </w:rPr>
               <w:t>4</w:t>
             </w:r>
           </w:p>
@@ -1907,6 +2024,9 @@
               <w:jc w:val="center"/>
             </w:pPr>
             <w:r>
+              <w:rPr>
+                <w:rFonts w:ascii="Times New Roman" w:hAnsi="Times New Roman"/>
+              </w:rPr>
               <w:t>5</w:t>
             </w:r>
           </w:p>
@@ -1925,6 +2045,9 @@
               <w:jc w:val="center"/>
             </w:pPr>
             <w:r>
+              <w:rPr>
+                <w:rFonts w:ascii="Times New Roman" w:hAnsi="Times New Roman"/>
+              </w:rPr>
               <w:t>6</w:t>
             </w:r>
           </w:p>
@@ -1943,6 +2066,9 @@
               <w:jc w:val="center"/>
             </w:pPr>
             <w:r>
+              <w:rPr>
+                <w:rFonts w:ascii="Times New Roman" w:hAnsi="Times New Roman"/>
+              </w:rPr>
               <w:t>7</w:t>
             </w:r>
           </w:p>
@@ -1961,6 +2087,9 @@
               <w:jc w:val="center"/>
             </w:pPr>
             <w:r>
+              <w:rPr>
+                <w:rFonts w:ascii="Times New Roman" w:hAnsi="Times New Roman"/>
+              </w:rPr>
               <w:t>8</w:t>
             </w:r>
           </w:p>
@@ -1979,6 +2108,9 @@
               <w:jc w:val="center"/>
             </w:pPr>
             <w:r>
+              <w:rPr>
+                <w:rFonts w:ascii="Times New Roman" w:hAnsi="Times New Roman"/>
+              </w:rPr>
               <w:t>9</w:t>
             </w:r>
           </w:p>
@@ -1997,6 +2129,9 @@
               <w:jc w:val="center"/>
             </w:pPr>
             <w:r>
+              <w:rPr>
+                <w:rFonts w:ascii="Times New Roman" w:hAnsi="Times New Roman"/>
+              </w:rPr>
               <w:t>10</w:t>
             </w:r>
           </w:p>
@@ -2008,13 +2143,9 @@
             <w:tcW w:w="3964" w:type="dxa"/>
           </w:tcPr>
           <w:p>
-            <w:pPr>
-              <w:spacing w:line="276" w:lineRule="auto"/>
-            </w:pPr>
             <w:r>
               <w:rPr>
                 <w:rFonts w:ascii="Times New Roman" w:hAnsi="Times New Roman"/>
-                <w:sz w:val="20"/>
               </w:rPr>
               <w:t>Nghiên cứu các bài báo và tài liệu liên quan (CTI, STIX 2.1, MITRE ATT&amp;CK, ReAct Agent)</w:t>
             </w:r>
@@ -2032,6 +2163,9 @@
               <w:jc w:val="center"/>
             </w:pPr>
             <w:r>
+              <w:rPr>
+                <w:rFonts w:ascii="Times New Roman" w:hAnsi="Times New Roman"/>
+              </w:rPr>
               <w:t>*</w:t>
             </w:r>
           </w:p>
@@ -2046,122 +2180,121 @@
             <w:pPr>
               <w:spacing w:line="360" w:lineRule="auto"/>
               <w:jc w:val="center"/>
-            </w:pPr>
-            <w:r>
-              <w:t>*</w:t>
-            </w:r>
-          </w:p>
-        </w:tc>
-        <w:tc>
-          <w:tcPr>
-            <w:tcW w:w="567" w:type="dxa"/>
-            <w:vAlign w:val="center"/>
-          </w:tcPr>
-          <w:p>
-            <w:pPr>
-              <w:spacing w:line="360" w:lineRule="auto"/>
-              <w:jc w:val="center"/>
-            </w:pPr>
-          </w:p>
-        </w:tc>
-        <w:tc>
-          <w:tcPr>
-            <w:tcW w:w="567" w:type="dxa"/>
-            <w:vAlign w:val="center"/>
-          </w:tcPr>
-          <w:p>
-            <w:pPr>
-              <w:spacing w:line="360" w:lineRule="auto"/>
-              <w:jc w:val="center"/>
-            </w:pPr>
-          </w:p>
-        </w:tc>
-        <w:tc>
-          <w:tcPr>
-            <w:tcW w:w="567" w:type="dxa"/>
-            <w:vAlign w:val="center"/>
-          </w:tcPr>
-          <w:p>
-            <w:pPr>
-              <w:spacing w:line="360" w:lineRule="auto"/>
-              <w:jc w:val="center"/>
-            </w:pPr>
-          </w:p>
-        </w:tc>
-        <w:tc>
-          <w:tcPr>
-            <w:tcW w:w="567" w:type="dxa"/>
-            <w:vAlign w:val="center"/>
-          </w:tcPr>
-          <w:p>
-            <w:pPr>
-              <w:spacing w:line="360" w:lineRule="auto"/>
-              <w:jc w:val="center"/>
-            </w:pPr>
-          </w:p>
-        </w:tc>
-        <w:tc>
-          <w:tcPr>
-            <w:tcW w:w="567" w:type="dxa"/>
-            <w:vAlign w:val="center"/>
-          </w:tcPr>
-          <w:p>
-            <w:pPr>
-              <w:spacing w:line="360" w:lineRule="auto"/>
-              <w:jc w:val="center"/>
-            </w:pPr>
-          </w:p>
-        </w:tc>
-        <w:tc>
-          <w:tcPr>
-            <w:tcW w:w="567" w:type="dxa"/>
-            <w:vAlign w:val="center"/>
-          </w:tcPr>
-          <w:p>
-            <w:pPr>
-              <w:spacing w:line="360" w:lineRule="auto"/>
-              <w:jc w:val="center"/>
-            </w:pPr>
-          </w:p>
-        </w:tc>
-        <w:tc>
-          <w:tcPr>
-            <w:tcW w:w="567" w:type="dxa"/>
-            <w:vAlign w:val="center"/>
-          </w:tcPr>
-          <w:p>
-            <w:pPr>
-              <w:spacing w:line="360" w:lineRule="auto"/>
-              <w:jc w:val="center"/>
-            </w:pPr>
-          </w:p>
-        </w:tc>
-        <w:tc>
-          <w:tcPr>
-            <w:tcW w:w="562" w:type="dxa"/>
-            <w:vAlign w:val="center"/>
-          </w:tcPr>
-          <w:p>
-            <w:pPr>
-              <w:spacing w:line="360" w:lineRule="auto"/>
-              <w:jc w:val="center"/>
-            </w:pPr>
-          </w:p>
-        </w:tc>
-      </w:tr>
-      <w:tr>
-        <w:tc>
-          <w:tcPr>
-            <w:tcW w:w="3964" w:type="dxa"/>
-          </w:tcPr>
-          <w:p>
-            <w:pPr>
-              <w:spacing w:line="276" w:lineRule="auto"/>
             </w:pPr>
             <w:r>
               <w:rPr>
                 <w:rFonts w:ascii="Times New Roman" w:hAnsi="Times New Roman"/>
-                <w:sz w:val="20"/>
+              </w:rPr>
+              <w:t>*</w:t>
+            </w:r>
+          </w:p>
+        </w:tc>
+        <w:tc>
+          <w:tcPr>
+            <w:tcW w:w="567" w:type="dxa"/>
+            <w:vAlign w:val="center"/>
+          </w:tcPr>
+          <w:p>
+            <w:pPr>
+              <w:spacing w:line="360" w:lineRule="auto"/>
+              <w:jc w:val="center"/>
+            </w:pPr>
+          </w:p>
+        </w:tc>
+        <w:tc>
+          <w:tcPr>
+            <w:tcW w:w="567" w:type="dxa"/>
+            <w:vAlign w:val="center"/>
+          </w:tcPr>
+          <w:p>
+            <w:pPr>
+              <w:spacing w:line="360" w:lineRule="auto"/>
+              <w:jc w:val="center"/>
+            </w:pPr>
+          </w:p>
+        </w:tc>
+        <w:tc>
+          <w:tcPr>
+            <w:tcW w:w="567" w:type="dxa"/>
+            <w:vAlign w:val="center"/>
+          </w:tcPr>
+          <w:p>
+            <w:pPr>
+              <w:spacing w:line="360" w:lineRule="auto"/>
+              <w:jc w:val="center"/>
+            </w:pPr>
+          </w:p>
+        </w:tc>
+        <w:tc>
+          <w:tcPr>
+            <w:tcW w:w="567" w:type="dxa"/>
+            <w:vAlign w:val="center"/>
+          </w:tcPr>
+          <w:p>
+            <w:pPr>
+              <w:spacing w:line="360" w:lineRule="auto"/>
+              <w:jc w:val="center"/>
+            </w:pPr>
+          </w:p>
+        </w:tc>
+        <w:tc>
+          <w:tcPr>
+            <w:tcW w:w="567" w:type="dxa"/>
+            <w:vAlign w:val="center"/>
+          </w:tcPr>
+          <w:p>
+            <w:pPr>
+              <w:spacing w:line="360" w:lineRule="auto"/>
+              <w:jc w:val="center"/>
+            </w:pPr>
+          </w:p>
+        </w:tc>
+        <w:tc>
+          <w:tcPr>
+            <w:tcW w:w="567" w:type="dxa"/>
+            <w:vAlign w:val="center"/>
+          </w:tcPr>
+          <w:p>
+            <w:pPr>
+              <w:spacing w:line="360" w:lineRule="auto"/>
+              <w:jc w:val="center"/>
+            </w:pPr>
+          </w:p>
+        </w:tc>
+        <w:tc>
+          <w:tcPr>
+            <w:tcW w:w="567" w:type="dxa"/>
+            <w:vAlign w:val="center"/>
+          </w:tcPr>
+          <w:p>
+            <w:pPr>
+              <w:spacing w:line="360" w:lineRule="auto"/>
+              <w:jc w:val="center"/>
+            </w:pPr>
+          </w:p>
+        </w:tc>
+        <w:tc>
+          <w:tcPr>
+            <w:tcW w:w="562" w:type="dxa"/>
+            <w:vAlign w:val="center"/>
+          </w:tcPr>
+          <w:p>
+            <w:pPr>
+              <w:spacing w:line="360" w:lineRule="auto"/>
+              <w:jc w:val="center"/>
+            </w:pPr>
+          </w:p>
+        </w:tc>
+      </w:tr>
+      <w:tr>
+        <w:tc>
+          <w:tcPr>
+            <w:tcW w:w="3964" w:type="dxa"/>
+          </w:tcPr>
+          <w:p>
+            <w:r>
+              <w:rPr>
+                <w:rFonts w:ascii="Times New Roman" w:hAnsi="Times New Roman"/>
               </w:rPr>
               <w:t>Thiết kế kiến trúc hệ thống, quy ước dữ liệu (Schemas) và cơ chế bộ nhớ đệm SQLite</w:t>
             </w:r>
@@ -2203,6 +2336,9 @@
               <w:jc w:val="center"/>
             </w:pPr>
             <w:r>
+              <w:rPr>
+                <w:rFonts w:ascii="Times New Roman" w:hAnsi="Times New Roman"/>
+              </w:rPr>
               <w:t>*</w:t>
             </w:r>
           </w:p>
@@ -2217,163 +2353,11 @@
             <w:pPr>
               <w:spacing w:line="360" w:lineRule="auto"/>
               <w:jc w:val="center"/>
-            </w:pPr>
-            <w:r>
-              <w:t>*</w:t>
-            </w:r>
-          </w:p>
-        </w:tc>
-        <w:tc>
-          <w:tcPr>
-            <w:tcW w:w="567" w:type="dxa"/>
-            <w:vAlign w:val="center"/>
-          </w:tcPr>
-          <w:p>
-            <w:pPr>
-              <w:spacing w:line="360" w:lineRule="auto"/>
-              <w:jc w:val="center"/>
-            </w:pPr>
-          </w:p>
-        </w:tc>
-        <w:tc>
-          <w:tcPr>
-            <w:tcW w:w="567" w:type="dxa"/>
-            <w:vAlign w:val="center"/>
-          </w:tcPr>
-          <w:p>
-            <w:pPr>
-              <w:spacing w:line="360" w:lineRule="auto"/>
-              <w:jc w:val="center"/>
-            </w:pPr>
-          </w:p>
-        </w:tc>
-        <w:tc>
-          <w:tcPr>
-            <w:tcW w:w="567" w:type="dxa"/>
-            <w:vAlign w:val="center"/>
-          </w:tcPr>
-          <w:p>
-            <w:pPr>
-              <w:spacing w:line="360" w:lineRule="auto"/>
-              <w:jc w:val="center"/>
-            </w:pPr>
-          </w:p>
-        </w:tc>
-        <w:tc>
-          <w:tcPr>
-            <w:tcW w:w="567" w:type="dxa"/>
-            <w:vAlign w:val="center"/>
-          </w:tcPr>
-          <w:p>
-            <w:pPr>
-              <w:spacing w:line="360" w:lineRule="auto"/>
-              <w:jc w:val="center"/>
-            </w:pPr>
-          </w:p>
-        </w:tc>
-        <w:tc>
-          <w:tcPr>
-            <w:tcW w:w="567" w:type="dxa"/>
-            <w:vAlign w:val="center"/>
-          </w:tcPr>
-          <w:p>
-            <w:pPr>
-              <w:spacing w:line="360" w:lineRule="auto"/>
-              <w:jc w:val="center"/>
-            </w:pPr>
-          </w:p>
-        </w:tc>
-        <w:tc>
-          <w:tcPr>
-            <w:tcW w:w="562" w:type="dxa"/>
-            <w:vAlign w:val="center"/>
-          </w:tcPr>
-          <w:p>
-            <w:pPr>
-              <w:spacing w:line="360" w:lineRule="auto"/>
-              <w:jc w:val="center"/>
-            </w:pPr>
-          </w:p>
-        </w:tc>
-      </w:tr>
-      <w:tr>
-        <w:tc>
-          <w:tcPr>
-            <w:tcW w:w="3964" w:type="dxa"/>
-          </w:tcPr>
-          <w:p>
-            <w:pPr>
-              <w:spacing w:line="276" w:lineRule="auto"/>
             </w:pPr>
             <w:r>
               <w:rPr>
                 <w:rFonts w:ascii="Times New Roman" w:hAnsi="Times New Roman"/>
-                <w:sz w:val="20"/>
               </w:rPr>
-              <w:t>Xây dựng bộ công cụ thu thập và làm giàu dữ liệu OSINT (RSS, CISA KEV, VirusTotal, AbuseIPDB)</w:t>
-            </w:r>
-          </w:p>
-        </w:tc>
-        <w:tc>
-          <w:tcPr>
-            <w:tcW w:w="567" w:type="dxa"/>
-            <w:vAlign w:val="center"/>
-          </w:tcPr>
-          <w:p>
-            <w:pPr>
-              <w:spacing w:line="360" w:lineRule="auto"/>
-              <w:jc w:val="center"/>
-            </w:pPr>
-          </w:p>
-        </w:tc>
-        <w:tc>
-          <w:tcPr>
-            <w:tcW w:w="567" w:type="dxa"/>
-            <w:vAlign w:val="center"/>
-          </w:tcPr>
-          <w:p>
-            <w:pPr>
-              <w:spacing w:line="360" w:lineRule="auto"/>
-              <w:jc w:val="center"/>
-            </w:pPr>
-          </w:p>
-        </w:tc>
-        <w:tc>
-          <w:tcPr>
-            <w:tcW w:w="567" w:type="dxa"/>
-            <w:vAlign w:val="center"/>
-          </w:tcPr>
-          <w:p>
-            <w:pPr>
-              <w:spacing w:line="360" w:lineRule="auto"/>
-              <w:jc w:val="center"/>
-            </w:pPr>
-          </w:p>
-        </w:tc>
-        <w:tc>
-          <w:tcPr>
-            <w:tcW w:w="567" w:type="dxa"/>
-            <w:vAlign w:val="center"/>
-          </w:tcPr>
-          <w:p>
-            <w:pPr>
-              <w:spacing w:line="360" w:lineRule="auto"/>
-              <w:jc w:val="center"/>
-            </w:pPr>
-          </w:p>
-        </w:tc>
-        <w:tc>
-          <w:tcPr>
-            <w:tcW w:w="567" w:type="dxa"/>
-            <w:shd w:val="clear" w:color="auto" w:fill="E97132" w:themeFill="accent2"/>
-            <w:vAlign w:val="center"/>
-          </w:tcPr>
-          <w:p>
-            <w:pPr>
-              <w:spacing w:line="360" w:lineRule="auto"/>
-              <w:jc w:val="center"/>
-            </w:pPr>
-            <w:r>
               <w:t>*</w:t>
             </w:r>
           </w:p>
@@ -2381,17 +2365,25 @@
         <w:tc>
           <w:tcPr>
             <w:tcW w:w="567" w:type="dxa"/>
-            <w:shd w:val="clear" w:color="auto" w:fill="E97132" w:themeFill="accent2"/>
-            <w:vAlign w:val="center"/>
-          </w:tcPr>
-          <w:p>
-            <w:pPr>
-              <w:spacing w:line="360" w:lineRule="auto"/>
-              <w:jc w:val="center"/>
-            </w:pPr>
-            <w:r>
-              <w:t>*</w:t>
-            </w:r>
+            <w:vAlign w:val="center"/>
+          </w:tcPr>
+          <w:p>
+            <w:pPr>
+              <w:spacing w:line="360" w:lineRule="auto"/>
+              <w:jc w:val="center"/>
+            </w:pPr>
+          </w:p>
+        </w:tc>
+        <w:tc>
+          <w:tcPr>
+            <w:tcW w:w="567" w:type="dxa"/>
+            <w:vAlign w:val="center"/>
+          </w:tcPr>
+          <w:p>
+            <w:pPr>
+              <w:spacing w:line="360" w:lineRule="auto"/>
+              <w:jc w:val="center"/>
+            </w:pPr>
           </w:p>
         </w:tc>
         <w:tc>
@@ -2449,40 +2441,12 @@
             <w:tcW w:w="3964" w:type="dxa"/>
           </w:tcPr>
           <w:p>
-            <w:pPr>
-              <w:spacing w:line="276" w:lineRule="auto"/>
-            </w:pPr>
             <w:r>
               <w:rPr>
                 <w:rFonts w:ascii="Times New Roman" w:hAnsi="Times New Roman"/>
-                <w:sz w:val="20"/>
               </w:rPr>
-              <w:t>Xây dựng Bộ não AI Agent và bộ công cụ sinh quy tắc phòng thủ (Sigma, YARA, Blocklist)</w:t>
+              <w:t>Xây dựng bộ công cụ thu thập OSINT (CISA KEV, TheHackerNews, BleepingComputer) và pipeline nạp dữ liệu sống</w:t>
             </w:r>
-          </w:p>
-        </w:tc>
-        <w:tc>
-          <w:tcPr>
-            <w:tcW w:w="567" w:type="dxa"/>
-            <w:vAlign w:val="center"/>
-          </w:tcPr>
-          <w:p>
-            <w:pPr>
-              <w:spacing w:line="360" w:lineRule="auto"/>
-              <w:jc w:val="center"/>
-            </w:pPr>
-          </w:p>
-        </w:tc>
-        <w:tc>
-          <w:tcPr>
-            <w:tcW w:w="567" w:type="dxa"/>
-            <w:vAlign w:val="center"/>
-          </w:tcPr>
-          <w:p>
-            <w:pPr>
-              <w:spacing w:line="360" w:lineRule="auto"/>
-              <w:jc w:val="center"/>
-            </w:pPr>
           </w:p>
         </w:tc>
         <w:tc>
@@ -2545,6 +2509,182 @@
               <w:jc w:val="center"/>
             </w:pPr>
             <w:r>
+              <w:rPr>
+                <w:rFonts w:ascii="Times New Roman" w:hAnsi="Times New Roman"/>
+              </w:rPr>
+              <w:t>*</w:t>
+            </w:r>
+          </w:p>
+        </w:tc>
+        <w:tc>
+          <w:tcPr>
+            <w:tcW w:w="567" w:type="dxa"/>
+            <w:shd w:val="clear" w:color="auto" w:fill="E97132" w:themeFill="accent2"/>
+            <w:vAlign w:val="center"/>
+          </w:tcPr>
+          <w:p>
+            <w:pPr>
+              <w:spacing w:line="360" w:lineRule="auto"/>
+              <w:jc w:val="center"/>
+            </w:pPr>
+            <w:r>
+              <w:rPr>
+                <w:rFonts w:ascii="Times New Roman" w:hAnsi="Times New Roman"/>
+              </w:rPr>
+              <w:t>*</w:t>
+            </w:r>
+          </w:p>
+        </w:tc>
+        <w:tc>
+          <w:tcPr>
+            <w:tcW w:w="567" w:type="dxa"/>
+            <w:vAlign w:val="center"/>
+          </w:tcPr>
+          <w:p>
+            <w:pPr>
+              <w:spacing w:line="360" w:lineRule="auto"/>
+              <w:jc w:val="center"/>
+            </w:pPr>
+          </w:p>
+        </w:tc>
+        <w:tc>
+          <w:tcPr>
+            <w:tcW w:w="567" w:type="dxa"/>
+            <w:vAlign w:val="center"/>
+          </w:tcPr>
+          <w:p>
+            <w:pPr>
+              <w:spacing w:line="360" w:lineRule="auto"/>
+              <w:jc w:val="center"/>
+            </w:pPr>
+          </w:p>
+        </w:tc>
+        <w:tc>
+          <w:tcPr>
+            <w:tcW w:w="567" w:type="dxa"/>
+            <w:vAlign w:val="center"/>
+          </w:tcPr>
+          <w:p>
+            <w:pPr>
+              <w:spacing w:line="360" w:lineRule="auto"/>
+              <w:jc w:val="center"/>
+            </w:pPr>
+          </w:p>
+        </w:tc>
+        <w:tc>
+          <w:tcPr>
+            <w:tcW w:w="562" w:type="dxa"/>
+            <w:vAlign w:val="center"/>
+          </w:tcPr>
+          <w:p>
+            <w:pPr>
+              <w:spacing w:line="360" w:lineRule="auto"/>
+              <w:jc w:val="center"/>
+            </w:pPr>
+          </w:p>
+        </w:tc>
+      </w:tr>
+      <w:tr>
+        <w:tc>
+          <w:tcPr>
+            <w:tcW w:w="3964" w:type="dxa"/>
+          </w:tcPr>
+          <w:p>
+            <w:r>
+              <w:rPr>
+                <w:rFonts w:ascii="Times New Roman" w:hAnsi="Times New Roman"/>
+              </w:rPr>
+              <w:t>Xây dựng Bộ não AI Agent, thẩm định VirusTotal/AbuseIPDB và sinh quy tắc phòng thủ (Sigma, YARA, Blocklist)</w:t>
+            </w:r>
+          </w:p>
+        </w:tc>
+        <w:tc>
+          <w:tcPr>
+            <w:tcW w:w="567" w:type="dxa"/>
+            <w:vAlign w:val="center"/>
+          </w:tcPr>
+          <w:p>
+            <w:pPr>
+              <w:spacing w:line="360" w:lineRule="auto"/>
+              <w:jc w:val="center"/>
+            </w:pPr>
+          </w:p>
+        </w:tc>
+        <w:tc>
+          <w:tcPr>
+            <w:tcW w:w="567" w:type="dxa"/>
+            <w:vAlign w:val="center"/>
+          </w:tcPr>
+          <w:p>
+            <w:pPr>
+              <w:spacing w:line="360" w:lineRule="auto"/>
+              <w:jc w:val="center"/>
+            </w:pPr>
+          </w:p>
+        </w:tc>
+        <w:tc>
+          <w:tcPr>
+            <w:tcW w:w="567" w:type="dxa"/>
+            <w:vAlign w:val="center"/>
+          </w:tcPr>
+          <w:p>
+            <w:pPr>
+              <w:spacing w:line="360" w:lineRule="auto"/>
+              <w:jc w:val="center"/>
+            </w:pPr>
+          </w:p>
+        </w:tc>
+        <w:tc>
+          <w:tcPr>
+            <w:tcW w:w="567" w:type="dxa"/>
+            <w:vAlign w:val="center"/>
+          </w:tcPr>
+          <w:p>
+            <w:pPr>
+              <w:spacing w:line="360" w:lineRule="auto"/>
+              <w:jc w:val="center"/>
+            </w:pPr>
+          </w:p>
+        </w:tc>
+        <w:tc>
+          <w:tcPr>
+            <w:tcW w:w="567" w:type="dxa"/>
+            <w:vAlign w:val="center"/>
+          </w:tcPr>
+          <w:p>
+            <w:pPr>
+              <w:spacing w:line="360" w:lineRule="auto"/>
+              <w:jc w:val="center"/>
+            </w:pPr>
+          </w:p>
+        </w:tc>
+        <w:tc>
+          <w:tcPr>
+            <w:tcW w:w="567" w:type="dxa"/>
+            <w:vAlign w:val="center"/>
+          </w:tcPr>
+          <w:p>
+            <w:pPr>
+              <w:spacing w:line="360" w:lineRule="auto"/>
+              <w:jc w:val="center"/>
+            </w:pPr>
+          </w:p>
+        </w:tc>
+        <w:tc>
+          <w:tcPr>
+            <w:tcW w:w="567" w:type="dxa"/>
+            <w:shd w:val="clear" w:color="auto" w:fill="E97132" w:themeFill="accent2"/>
+            <w:vAlign w:val="center"/>
+          </w:tcPr>
+          <w:p>
+            <w:pPr>
+              <w:spacing w:line="360" w:lineRule="auto"/>
+              <w:jc w:val="center"/>
+            </w:pPr>
+            <w:r>
+              <w:rPr>
+                <w:rFonts w:ascii="Times New Roman" w:hAnsi="Times New Roman"/>
+              </w:rPr>
               <w:t>*</w:t>
             </w:r>
           </w:p>
@@ -2595,13 +2735,9 @@
             <w:tcW w:w="3964" w:type="dxa"/>
           </w:tcPr>
           <w:p>
-            <w:pPr>
-              <w:spacing w:line="276" w:lineRule="auto"/>
-            </w:pPr>
             <w:r>
               <w:rPr>
                 <w:rFonts w:ascii="Times New Roman" w:hAnsi="Times New Roman"/>
-                <w:sz w:val="20"/>
               </w:rPr>
               <w:t>Xây dựng Backend FastAPI và giao diện Web Dashboard trực quan hóa</w:t>
             </w:r>
@@ -2703,6 +2839,9 @@
               <w:jc w:val="center"/>
             </w:pPr>
             <w:r>
+              <w:rPr>
+                <w:rFonts w:ascii="Times New Roman" w:hAnsi="Times New Roman"/>
+              </w:rPr>
               <w:t>*</w:t>
             </w:r>
           </w:p>
@@ -2738,15 +2877,11 @@
             <w:tcW w:w="3964" w:type="dxa"/>
           </w:tcPr>
           <w:p>
-            <w:pPr>
-              <w:spacing w:line="276" w:lineRule="auto"/>
-            </w:pPr>
             <w:r>
               <w:rPr>
                 <w:rFonts w:ascii="Times New Roman" w:hAnsi="Times New Roman"/>
-                <w:sz w:val="20"/>
               </w:rPr>
-              <w:t>Đánh giá thực nghiệm hệ thống trên các báo cáo APT và kiểm định cú pháp quy tắc</w:t>
+              <w:t>Đánh giá thực nghiệm hệ thống trên các báo cáo APT thực tế và kiểm định cú pháp quy tắc</w:t>
             </w:r>
           </w:p>
         </w:tc>
@@ -2856,38 +2991,37 @@
             <w:pPr>
               <w:spacing w:line="360" w:lineRule="auto"/>
               <w:jc w:val="center"/>
-            </w:pPr>
-            <w:r>
-              <w:t>*</w:t>
-            </w:r>
-          </w:p>
-        </w:tc>
-        <w:tc>
-          <w:tcPr>
-            <w:tcW w:w="562" w:type="dxa"/>
-            <w:vAlign w:val="center"/>
-          </w:tcPr>
-          <w:p>
-            <w:pPr>
-              <w:spacing w:line="360" w:lineRule="auto"/>
-              <w:jc w:val="center"/>
-            </w:pPr>
-          </w:p>
-        </w:tc>
-      </w:tr>
-      <w:tr>
-        <w:tc>
-          <w:tcPr>
-            <w:tcW w:w="3964" w:type="dxa"/>
-          </w:tcPr>
-          <w:p>
-            <w:pPr>
-              <w:spacing w:line="276" w:lineRule="auto"/>
             </w:pPr>
             <w:r>
               <w:rPr>
                 <w:rFonts w:ascii="Times New Roman" w:hAnsi="Times New Roman"/>
-                <w:sz w:val="20"/>
+              </w:rPr>
+              <w:t>*</w:t>
+            </w:r>
+          </w:p>
+        </w:tc>
+        <w:tc>
+          <w:tcPr>
+            <w:tcW w:w="562" w:type="dxa"/>
+            <w:vAlign w:val="center"/>
+          </w:tcPr>
+          <w:p>
+            <w:pPr>
+              <w:spacing w:line="360" w:lineRule="auto"/>
+              <w:jc w:val="center"/>
+            </w:pPr>
+          </w:p>
+        </w:tc>
+      </w:tr>
+      <w:tr>
+        <w:tc>
+          <w:tcPr>
+            <w:tcW w:w="3964" w:type="dxa"/>
+          </w:tcPr>
+          <w:p>
+            <w:r>
+              <w:rPr>
+                <w:rFonts w:ascii="Times New Roman" w:hAnsi="Times New Roman"/>
               </w:rPr>
               <w:t>Viết báo cáo chi tiết và chuẩn bị demo nghiệm thu</w:t>
             </w:r>
@@ -3043,6 +3177,9 @@
               <w:jc w:val="center"/>
             </w:pPr>
             <w:r>
+              <w:rPr>
+                <w:rFonts w:ascii="Times New Roman" w:hAnsi="Times New Roman"/>
+              </w:rPr>
               <w:t>*</w:t>
             </w:r>
           </w:p>

</xml_diff>